<commit_message>
Adding the regression lines
</commit_message>
<xml_diff>
--- a/Statistical explanation Thati 2026.docx
+++ b/Statistical explanation Thati 2026.docx
@@ -7,7 +7,451 @@
         <w:pStyle w:val="Normal"/>
         <w:bidi w:val="0"/>
         <w:jc w:val="start"/>
+        <w:rPr>
+          <w:rFonts w:ascii="Times New Roman" w:hAnsi="Times New Roman"/>
+          <w:b/>
+          <w:bCs/>
+        </w:rPr>
+      </w:pPr>
+      <w:r>
+        <w:rPr>
+          <w:rFonts w:ascii="Times New Roman" w:hAnsi="Times New Roman"/>
+          <w:b/>
+          <w:bCs/>
+        </w:rPr>
+        <w:t>Methods</w:t>
+      </w:r>
+    </w:p>
+    <w:p>
+      <w:pPr>
+        <w:pStyle w:val="Normal"/>
+        <w:bidi w:val="0"/>
+        <w:jc w:val="start"/>
+        <w:rPr>
+          <w:rFonts w:ascii="Times New Roman" w:hAnsi="Times New Roman"/>
+          <w:b/>
+          <w:bCs/>
+        </w:rPr>
+      </w:pPr>
+      <w:r>
+        <w:rPr>
+          <w:rFonts w:ascii="Times New Roman" w:hAnsi="Times New Roman"/>
+          <w:b/>
+          <w:bCs/>
+        </w:rPr>
+      </w:r>
+    </w:p>
+    <w:p>
+      <w:pPr>
+        <w:pStyle w:val="Normal"/>
+        <w:bidi w:val="0"/>
+        <w:jc w:val="both"/>
         <w:rPr/>
+      </w:pPr>
+      <w:r>
+        <w:rPr>
+          <w:rFonts w:ascii="Times New Roman" w:hAnsi="Times New Roman"/>
+          <w:b/>
+          <w:bCs/>
+        </w:rPr>
+        <w:tab/>
+      </w:r>
+      <w:r>
+        <w:rPr>
+          <w:rFonts w:ascii="Times New Roman" w:hAnsi="Times New Roman"/>
+          <w:b w:val="false"/>
+          <w:bCs w:val="false"/>
+        </w:rPr>
+        <w:t xml:space="preserve">To measure if there was a true correlation between the treatment and the expression of proteins, it was fitted a linear regression </w:t>
+      </w:r>
+      <w:r>
+        <w:rPr>
+          <w:rFonts w:ascii="Times New Roman" w:hAnsi="Times New Roman"/>
+          <w:b w:val="false"/>
+          <w:bCs w:val="false"/>
+          <w:i w:val="false"/>
+          <w:caps w:val="false"/>
+          <w:smallCaps w:val="false"/>
+          <w:u w:val="none"/>
+          <w:vertAlign w:val="superscript"/>
+        </w:rPr>
+        <w:t>1</w:t>
+      </w:r>
+      <w:r>
+        <w:rPr>
+          <w:rFonts w:ascii="Times New Roman" w:hAnsi="Times New Roman"/>
+          <w:b w:val="false"/>
+          <w:bCs w:val="false"/>
+        </w:rPr>
+        <w:t xml:space="preserve"> to the logarithmic value of the nanoparticle's concentration and the relative value of the protein's expression through western blot desnsitometry. The logarithmic was chosen due to the order of magnitude of the nanoparticle's concentrations tested. The R language</w:t>
+      </w:r>
+      <w:r>
+        <w:rPr>
+          <w:rFonts w:ascii="Times New Roman" w:hAnsi="Times New Roman"/>
+          <w:b w:val="false"/>
+          <w:bCs w:val="false"/>
+          <w:vertAlign w:val="superscript"/>
+        </w:rPr>
+        <w:t xml:space="preserve"> 2</w:t>
+      </w:r>
+      <w:r>
+        <w:rPr>
+          <w:rFonts w:ascii="Times New Roman" w:hAnsi="Times New Roman"/>
+          <w:b w:val="false"/>
+          <w:bCs w:val="false"/>
+          <w:position w:val="0"/>
+          <w:sz w:val="24"/>
+          <w:vertAlign w:val="baseline"/>
+        </w:rPr>
+        <w:t>, RStudio</w:t>
+      </w:r>
+      <w:r>
+        <w:rPr>
+          <w:rFonts w:ascii="Times New Roman" w:hAnsi="Times New Roman"/>
+          <w:b w:val="false"/>
+          <w:bCs w:val="false"/>
+          <w:vertAlign w:val="superscript"/>
+        </w:rPr>
+        <w:t>3</w:t>
+      </w:r>
+      <w:r>
+        <w:rPr>
+          <w:rFonts w:ascii="Times New Roman" w:hAnsi="Times New Roman"/>
+          <w:b w:val="false"/>
+          <w:bCs w:val="false"/>
+          <w:position w:val="0"/>
+          <w:sz w:val="24"/>
+          <w:vertAlign w:val="baseline"/>
+        </w:rPr>
+        <w:t xml:space="preserve"> and the ggplot2 package</w:t>
+      </w:r>
+      <w:r>
+        <w:rPr>
+          <w:rFonts w:ascii="Times New Roman" w:hAnsi="Times New Roman"/>
+          <w:b w:val="false"/>
+          <w:bCs w:val="false"/>
+          <w:vertAlign w:val="superscript"/>
+        </w:rPr>
+        <w:t xml:space="preserve">4 </w:t>
+      </w:r>
+      <w:r>
+        <w:rPr>
+          <w:rFonts w:ascii="Times New Roman" w:hAnsi="Times New Roman"/>
+          <w:b w:val="false"/>
+          <w:bCs w:val="false"/>
+          <w:position w:val="0"/>
+          <w:sz w:val="24"/>
+          <w:vertAlign w:val="baseline"/>
+        </w:rPr>
+        <w:t>were</w:t>
+      </w:r>
+      <w:r>
+        <w:rPr>
+          <w:rFonts w:ascii="Times New Roman" w:hAnsi="Times New Roman"/>
+          <w:b w:val="false"/>
+          <w:bCs w:val="false"/>
+        </w:rPr>
+        <w:t xml:space="preserve"> utilized to perform and analyze the regression.</w:t>
+      </w:r>
+    </w:p>
+    <w:p>
+      <w:pPr>
+        <w:pStyle w:val="Normal"/>
+        <w:bidi w:val="0"/>
+        <w:jc w:val="start"/>
+        <w:rPr>
+          <w:rFonts w:ascii="Times New Roman" w:hAnsi="Times New Roman"/>
+          <w:b w:val="false"/>
+          <w:bCs w:val="false"/>
+        </w:rPr>
+      </w:pPr>
+      <w:r>
+        <w:rPr/>
+      </w:r>
+    </w:p>
+    <w:p>
+      <w:pPr>
+        <w:pStyle w:val="Normal"/>
+        <w:bidi w:val="0"/>
+        <w:jc w:val="start"/>
+        <w:rPr>
+          <w:b/>
+          <w:bCs/>
+        </w:rPr>
+      </w:pPr>
+      <w:r>
+        <w:rPr>
+          <w:rFonts w:ascii="Times New Roman" w:hAnsi="Times New Roman"/>
+          <w:b/>
+          <w:bCs/>
+        </w:rPr>
+        <w:t>Results</w:t>
+      </w:r>
+    </w:p>
+    <w:p>
+      <w:pPr>
+        <w:pStyle w:val="Normal"/>
+        <w:bidi w:val="0"/>
+        <w:jc w:val="start"/>
+        <w:rPr>
+          <w:rFonts w:ascii="Times New Roman" w:hAnsi="Times New Roman"/>
+        </w:rPr>
+      </w:pPr>
+      <w:r>
+        <w:rPr>
+          <w:b/>
+          <w:bCs/>
+        </w:rPr>
+      </w:r>
+    </w:p>
+    <w:p>
+      <w:pPr>
+        <w:pStyle w:val="Normal"/>
+        <w:bidi w:val="0"/>
+        <w:jc w:val="start"/>
+        <w:rPr>
+          <w:b/>
+          <w:bCs/>
+        </w:rPr>
+      </w:pPr>
+      <w:r>
+        <w:rPr>
+          <w:rFonts w:ascii="Times New Roman" w:hAnsi="Times New Roman"/>
+          <w:b/>
+          <w:bCs/>
+        </w:rPr>
+        <w:tab/>
+      </w:r>
+    </w:p>
+    <w:p>
+      <w:pPr>
+        <w:pStyle w:val="Normal"/>
+        <w:bidi w:val="0"/>
+        <w:jc w:val="start"/>
+        <w:rPr>
+          <w:b w:val="false"/>
+          <w:bCs w:val="false"/>
+        </w:rPr>
+      </w:pPr>
+      <w:r>
+        <w:rPr>
+          <w:rFonts w:ascii="Times New Roman" w:hAnsi="Times New Roman"/>
+          <w:b/>
+          <w:bCs/>
+        </w:rPr>
+      </w:r>
+    </w:p>
+    <w:p>
+      <w:pPr>
+        <w:pStyle w:val="Normal"/>
+        <w:bidi w:val="0"/>
+        <w:jc w:val="start"/>
+        <w:rPr>
+          <w:rFonts w:ascii="Times New Roman" w:hAnsi="Times New Roman"/>
+          <w:b/>
+          <w:bCs/>
+        </w:rPr>
+      </w:pPr>
+      <w:r>
+        <w:rPr>
+          <w:rFonts w:ascii="Times New Roman" w:hAnsi="Times New Roman"/>
+          <w:b/>
+          <w:bCs/>
+        </w:rPr>
+        <w:t>References</w:t>
+      </w:r>
+    </w:p>
+    <w:p>
+      <w:pPr>
+        <w:pStyle w:val="Normal"/>
+        <w:bidi w:val="0"/>
+        <w:jc w:val="start"/>
+        <w:rPr>
+          <w:rFonts w:ascii="Times New Roman" w:hAnsi="Times New Roman"/>
+          <w:b w:val="false"/>
+          <w:bCs w:val="false"/>
+        </w:rPr>
+      </w:pPr>
+      <w:r>
+        <w:rPr/>
+      </w:r>
+    </w:p>
+    <w:p>
+      <w:pPr>
+        <w:pStyle w:val="Bibliografia1"/>
+        <w:bidi w:val="0"/>
+        <w:jc w:val="start"/>
+        <w:rPr/>
+      </w:pPr>
+      <w:r>
+        <w:rPr>
+          <w:rFonts w:ascii="Times New Roman" w:hAnsi="Times New Roman"/>
+          <w:b w:val="false"/>
+          <w:bCs w:val="false"/>
+        </w:rPr>
+        <w:t>1.</w:t>
+      </w:r>
+      <w:r>
+        <w:rPr/>
+        <w:tab/>
+        <w:t xml:space="preserve">James G, Witten D, Hastie T, Tibshirani R. Linear Regression. In: James G, Witten D, Hastie T, Tibshirani R, eds. </w:t>
+      </w:r>
+      <w:r>
+        <w:rPr>
+          <w:i/>
+        </w:rPr>
+        <w:t>An Introduction to Statistical Learning: With Applications in R</w:t>
+      </w:r>
+      <w:r>
+        <w:rPr/>
+        <w:t>. Springer US; 2021:59-128. doi:10.1007/978-1-0716-1418-1_3</w:t>
+      </w:r>
+      <w:r>
+        <w:rPr>
+          <w:rFonts w:ascii="Times New Roman" w:hAnsi="Times New Roman"/>
+          <w:b w:val="false"/>
+          <w:bCs w:val="false"/>
+        </w:rPr>
+        <w:t xml:space="preserve"> </w:t>
+      </w:r>
+    </w:p>
+    <w:p>
+      <w:pPr>
+        <w:pStyle w:val="Bibliografia1"/>
+        <w:bidi w:val="0"/>
+        <w:jc w:val="start"/>
+        <w:rPr/>
+      </w:pPr>
+      <w:r>
+        <w:rPr>
+          <w:rFonts w:ascii="Times New Roman" w:hAnsi="Times New Roman"/>
+          <w:b w:val="false"/>
+          <w:bCs w:val="false"/>
+        </w:rPr>
+        <w:t xml:space="preserve">2. R Core Team 2026. </w:t>
+      </w:r>
+      <w:r>
+        <w:rPr>
+          <w:rFonts w:ascii="Times New Roman" w:hAnsi="Times New Roman"/>
+          <w:b w:val="false"/>
+          <w:bCs w:val="false"/>
+          <w:i/>
+          <w:iCs/>
+        </w:rPr>
+        <w:t xml:space="preserve">R: A language and environment for statistical computing. </w:t>
+      </w:r>
+      <w:r>
+        <w:rPr>
+          <w:rFonts w:ascii="Times New Roman" w:hAnsi="Times New Roman"/>
+          <w:b w:val="false"/>
+          <w:bCs w:val="false"/>
+          <w:i w:val="false"/>
+          <w:iCs w:val="false"/>
+        </w:rPr>
+        <w:t>Vienna, Austria: R Foundation for Statiscal Computing. URL: https:/www.R-project.org/.</w:t>
+      </w:r>
+    </w:p>
+    <w:p>
+      <w:pPr>
+        <w:pStyle w:val="Bibliografia1"/>
+        <w:bidi w:val="0"/>
+        <w:jc w:val="start"/>
+        <w:rPr/>
+      </w:pPr>
+      <w:r>
+        <w:rPr>
+          <w:rFonts w:ascii="Times New Roman" w:hAnsi="Times New Roman"/>
+          <w:b w:val="false"/>
+          <w:bCs w:val="false"/>
+          <w:i w:val="false"/>
+          <w:iCs w:val="false"/>
+        </w:rPr>
+        <w:t xml:space="preserve">3. Posit team. (2026). </w:t>
+      </w:r>
+      <w:r>
+        <w:rPr>
+          <w:rFonts w:ascii="Times New Roman" w:hAnsi="Times New Roman"/>
+          <w:b w:val="false"/>
+          <w:bCs w:val="false"/>
+          <w:i/>
+          <w:iCs/>
+        </w:rPr>
+        <w:t xml:space="preserve">RStudio: Integrated Development Environment for R. </w:t>
+      </w:r>
+      <w:r>
+        <w:rPr>
+          <w:rFonts w:ascii="Times New Roman" w:hAnsi="Times New Roman"/>
+          <w:b w:val="false"/>
+          <w:bCs w:val="false"/>
+          <w:i w:val="false"/>
+          <w:iCs w:val="false"/>
+        </w:rPr>
+        <w:t>Posit Software, PBC. http://www.posit.co/</w:t>
+      </w:r>
+    </w:p>
+    <w:p>
+      <w:pPr>
+        <w:pStyle w:val="Bibliografia1"/>
+        <w:bidi w:val="0"/>
+        <w:jc w:val="start"/>
+        <w:rPr/>
+      </w:pPr>
+      <w:r>
+        <w:rPr>
+          <w:rFonts w:ascii="Times New Roman" w:hAnsi="Times New Roman"/>
+          <w:b w:val="false"/>
+          <w:bCs w:val="false"/>
+          <w:i w:val="false"/>
+          <w:iCs w:val="false"/>
+        </w:rPr>
+        <w:t>4</w:t>
+      </w:r>
+      <w:r>
+        <w:rPr>
+          <w:rFonts w:ascii="Times New Roman" w:hAnsi="Times New Roman"/>
+          <w:b w:val="false"/>
+          <w:bCs w:val="false"/>
+          <w:i w:val="false"/>
+          <w:iCs w:val="false"/>
+        </w:rPr>
+        <w:t xml:space="preserve">. Wickham, H. (2016). </w:t>
+      </w:r>
+      <w:r>
+        <w:rPr>
+          <w:rFonts w:ascii="Times New Roman" w:hAnsi="Times New Roman"/>
+          <w:b w:val="false"/>
+          <w:bCs w:val="false"/>
+          <w:i/>
+          <w:iCs/>
+        </w:rPr>
+        <w:t>ggplot2: Elegant Graphics for Data Analysis.</w:t>
+      </w:r>
+      <w:r>
+        <w:rPr>
+          <w:rFonts w:ascii="Times New Roman" w:hAnsi="Times New Roman"/>
+          <w:b w:val="false"/>
+          <w:bCs w:val="false"/>
+          <w:i w:val="false"/>
+          <w:iCs w:val="false"/>
+        </w:rPr>
+        <w:t>Springer-Verlag New York.</w:t>
+      </w:r>
+    </w:p>
+    <w:p>
+      <w:pPr>
+        <w:pStyle w:val="Normal"/>
+        <w:numPr>
+          <w:ilvl w:val="0"/>
+          <w:numId w:val="0"/>
+        </w:numPr>
+        <w:bidi w:val="0"/>
+        <w:ind w:hanging="0" w:start="840"/>
+        <w:jc w:val="start"/>
+        <w:rPr>
+          <w:rFonts w:ascii="Times New Roman" w:hAnsi="Times New Roman"/>
+          <w:b w:val="false"/>
+          <w:bCs w:val="false"/>
+        </w:rPr>
       </w:pPr>
       <w:r>
         <w:rPr/>
@@ -20,9 +464,259 @@
       <w:pgNumType w:fmt="decimal"/>
       <w:formProt w:val="false"/>
       <w:textDirection w:val="lrTb"/>
+      <w:docGrid w:type="default" w:linePitch="312" w:charSpace="4294961151"/>
     </w:sectPr>
   </w:body>
 </w:document>
+</file>
+
+<file path=word/numbering.xml><?xml version="1.0" encoding="utf-8"?>
+<w:numbering xmlns:w="http://schemas.openxmlformats.org/wordprocessingml/2006/main" xmlns:o="urn:schemas-microsoft-com:office:office" xmlns:r="http://schemas.openxmlformats.org/officeDocument/2006/relationships" xmlns:v="urn:schemas-microsoft-com:vml" xmlns:mc="http://schemas.openxmlformats.org/markup-compatibility/2006" xmlns:w14="http://schemas.microsoft.com/office/word/2010/wordml" mc:Ignorable="w14">
+  <w:abstractNum w:abstractNumId="1">
+    <w:lvl w:ilvl="0">
+      <w:start w:val="1"/>
+      <w:numFmt w:val="decimal"/>
+      <w:lvlText w:val="%1."/>
+      <w:lvlJc w:val="start"/>
+      <w:pPr>
+        <w:tabs>
+          <w:tab w:val="num" w:pos="840"/>
+        </w:tabs>
+        <w:ind w:start="840" w:hanging="360"/>
+      </w:pPr>
+      <w:rPr/>
+    </w:lvl>
+    <w:lvl w:ilvl="1">
+      <w:start w:val="1"/>
+      <w:numFmt w:val="decimal"/>
+      <w:lvlText w:val="%2."/>
+      <w:lvlJc w:val="start"/>
+      <w:pPr>
+        <w:tabs>
+          <w:tab w:val="num" w:pos="1200"/>
+        </w:tabs>
+        <w:ind w:start="1200" w:hanging="360"/>
+      </w:pPr>
+      <w:rPr/>
+    </w:lvl>
+    <w:lvl w:ilvl="2">
+      <w:start w:val="1"/>
+      <w:numFmt w:val="decimal"/>
+      <w:lvlText w:val="%3."/>
+      <w:lvlJc w:val="start"/>
+      <w:pPr>
+        <w:tabs>
+          <w:tab w:val="num" w:pos="1560"/>
+        </w:tabs>
+        <w:ind w:start="1560" w:hanging="360"/>
+      </w:pPr>
+      <w:rPr/>
+    </w:lvl>
+    <w:lvl w:ilvl="3">
+      <w:start w:val="1"/>
+      <w:numFmt w:val="decimal"/>
+      <w:lvlText w:val="%4."/>
+      <w:lvlJc w:val="start"/>
+      <w:pPr>
+        <w:tabs>
+          <w:tab w:val="num" w:pos="1920"/>
+        </w:tabs>
+        <w:ind w:start="1920" w:hanging="360"/>
+      </w:pPr>
+      <w:rPr/>
+    </w:lvl>
+    <w:lvl w:ilvl="4">
+      <w:start w:val="1"/>
+      <w:numFmt w:val="decimal"/>
+      <w:lvlText w:val="%5."/>
+      <w:lvlJc w:val="start"/>
+      <w:pPr>
+        <w:tabs>
+          <w:tab w:val="num" w:pos="2280"/>
+        </w:tabs>
+        <w:ind w:start="2280" w:hanging="360"/>
+      </w:pPr>
+      <w:rPr/>
+    </w:lvl>
+    <w:lvl w:ilvl="5">
+      <w:start w:val="1"/>
+      <w:numFmt w:val="decimal"/>
+      <w:lvlText w:val="%6."/>
+      <w:lvlJc w:val="start"/>
+      <w:pPr>
+        <w:tabs>
+          <w:tab w:val="num" w:pos="2640"/>
+        </w:tabs>
+        <w:ind w:start="2640" w:hanging="360"/>
+      </w:pPr>
+      <w:rPr/>
+    </w:lvl>
+    <w:lvl w:ilvl="6">
+      <w:start w:val="1"/>
+      <w:numFmt w:val="decimal"/>
+      <w:lvlText w:val="%7."/>
+      <w:lvlJc w:val="start"/>
+      <w:pPr>
+        <w:tabs>
+          <w:tab w:val="num" w:pos="3000"/>
+        </w:tabs>
+        <w:ind w:start="3000" w:hanging="360"/>
+      </w:pPr>
+      <w:rPr/>
+    </w:lvl>
+    <w:lvl w:ilvl="7">
+      <w:start w:val="1"/>
+      <w:numFmt w:val="decimal"/>
+      <w:lvlText w:val="%8."/>
+      <w:lvlJc w:val="start"/>
+      <w:pPr>
+        <w:tabs>
+          <w:tab w:val="num" w:pos="3360"/>
+        </w:tabs>
+        <w:ind w:start="3360" w:hanging="360"/>
+      </w:pPr>
+      <w:rPr/>
+    </w:lvl>
+    <w:lvl w:ilvl="8">
+      <w:start w:val="1"/>
+      <w:numFmt w:val="decimal"/>
+      <w:lvlText w:val="%9."/>
+      <w:lvlJc w:val="start"/>
+      <w:pPr>
+        <w:tabs>
+          <w:tab w:val="num" w:pos="3720"/>
+        </w:tabs>
+        <w:ind w:start="3720" w:hanging="360"/>
+      </w:pPr>
+      <w:rPr/>
+    </w:lvl>
+  </w:abstractNum>
+  <w:abstractNum w:abstractNumId="2">
+    <w:lvl w:ilvl="0">
+      <w:start w:val="1"/>
+      <w:numFmt w:val="none"/>
+      <w:suff w:val="nothing"/>
+      <w:lvlText w:val=""/>
+      <w:lvlJc w:val="start"/>
+      <w:pPr>
+        <w:tabs>
+          <w:tab w:val="num" w:pos="0"/>
+        </w:tabs>
+        <w:ind w:start="0" w:hanging="0"/>
+      </w:pPr>
+    </w:lvl>
+    <w:lvl w:ilvl="1">
+      <w:start w:val="1"/>
+      <w:numFmt w:val="none"/>
+      <w:suff w:val="nothing"/>
+      <w:lvlText w:val=""/>
+      <w:lvlJc w:val="start"/>
+      <w:pPr>
+        <w:tabs>
+          <w:tab w:val="num" w:pos="0"/>
+        </w:tabs>
+        <w:ind w:start="0" w:hanging="0"/>
+      </w:pPr>
+    </w:lvl>
+    <w:lvl w:ilvl="2">
+      <w:start w:val="1"/>
+      <w:numFmt w:val="none"/>
+      <w:suff w:val="nothing"/>
+      <w:lvlText w:val=""/>
+      <w:lvlJc w:val="start"/>
+      <w:pPr>
+        <w:tabs>
+          <w:tab w:val="num" w:pos="0"/>
+        </w:tabs>
+        <w:ind w:start="0" w:hanging="0"/>
+      </w:pPr>
+    </w:lvl>
+    <w:lvl w:ilvl="3">
+      <w:start w:val="1"/>
+      <w:numFmt w:val="none"/>
+      <w:suff w:val="nothing"/>
+      <w:lvlText w:val=""/>
+      <w:lvlJc w:val="start"/>
+      <w:pPr>
+        <w:tabs>
+          <w:tab w:val="num" w:pos="0"/>
+        </w:tabs>
+        <w:ind w:start="0" w:hanging="0"/>
+      </w:pPr>
+    </w:lvl>
+    <w:lvl w:ilvl="4">
+      <w:start w:val="1"/>
+      <w:numFmt w:val="none"/>
+      <w:suff w:val="nothing"/>
+      <w:lvlText w:val=""/>
+      <w:lvlJc w:val="start"/>
+      <w:pPr>
+        <w:tabs>
+          <w:tab w:val="num" w:pos="0"/>
+        </w:tabs>
+        <w:ind w:start="0" w:hanging="0"/>
+      </w:pPr>
+    </w:lvl>
+    <w:lvl w:ilvl="5">
+      <w:start w:val="1"/>
+      <w:numFmt w:val="none"/>
+      <w:suff w:val="nothing"/>
+      <w:lvlText w:val=""/>
+      <w:lvlJc w:val="start"/>
+      <w:pPr>
+        <w:tabs>
+          <w:tab w:val="num" w:pos="0"/>
+        </w:tabs>
+        <w:ind w:start="0" w:hanging="0"/>
+      </w:pPr>
+    </w:lvl>
+    <w:lvl w:ilvl="6">
+      <w:start w:val="1"/>
+      <w:numFmt w:val="none"/>
+      <w:suff w:val="nothing"/>
+      <w:lvlText w:val=""/>
+      <w:lvlJc w:val="start"/>
+      <w:pPr>
+        <w:tabs>
+          <w:tab w:val="num" w:pos="0"/>
+        </w:tabs>
+        <w:ind w:start="0" w:hanging="0"/>
+      </w:pPr>
+    </w:lvl>
+    <w:lvl w:ilvl="7">
+      <w:start w:val="1"/>
+      <w:numFmt w:val="none"/>
+      <w:suff w:val="nothing"/>
+      <w:lvlText w:val=""/>
+      <w:lvlJc w:val="start"/>
+      <w:pPr>
+        <w:tabs>
+          <w:tab w:val="num" w:pos="0"/>
+        </w:tabs>
+        <w:ind w:start="0" w:hanging="0"/>
+      </w:pPr>
+    </w:lvl>
+    <w:lvl w:ilvl="8">
+      <w:start w:val="1"/>
+      <w:numFmt w:val="none"/>
+      <w:suff w:val="nothing"/>
+      <w:lvlText w:val=""/>
+      <w:lvlJc w:val="start"/>
+      <w:pPr>
+        <w:tabs>
+          <w:tab w:val="num" w:pos="0"/>
+        </w:tabs>
+        <w:ind w:start="0" w:hanging="0"/>
+      </w:pPr>
+    </w:lvl>
+  </w:abstractNum>
+  <w:num w:numId="1">
+    <w:abstractNumId w:val="1"/>
+  </w:num>
+  <w:num w:numId="2">
+    <w:abstractNumId w:val="2"/>
+  </w:num>
+</w:numbering>
 </file>
 
 <file path=word/styles.xml><?xml version="1.0" encoding="utf-8"?>
@@ -59,6 +753,11 @@
       <w:szCs w:val="24"/>
       <w:lang w:val="en-US" w:eastAsia="zh-CN" w:bidi="hi-IN"/>
     </w:rPr>
+  </w:style>
+  <w:style w:type="character" w:styleId="Smbolosdenumerao">
+    <w:name w:val="Símbolos de numeração"/>
+    <w:qFormat/>
+    <w:rPr/>
   </w:style>
   <w:style w:type="paragraph" w:styleId="Ttulo">
     <w:name w:val="Título"/>
@@ -117,6 +816,20 @@
     <w:rPr>
       <w:rFonts w:cs="Lucida Sans"/>
     </w:rPr>
+  </w:style>
+  <w:style w:type="paragraph" w:styleId="Bibliografia1">
+    <w:name w:val="Bibliografia 1"/>
+    <w:basedOn w:val="Ndice"/>
+    <w:qFormat/>
+    <w:pPr>
+      <w:tabs>
+        <w:tab w:val="clear" w:pos="709"/>
+        <w:tab w:val="left" w:pos="528" w:leader="none"/>
+      </w:tabs>
+      <w:spacing w:lineRule="atLeast" w:line="240" w:before="0" w:after="240"/>
+      <w:ind w:hanging="264" w:start="264"/>
+    </w:pPr>
+    <w:rPr/>
   </w:style>
 </w:styles>
 </file>

</xml_diff>